<commit_message>
N.D. Ind. bankruptcy adversary complaint: footnotes kept whole on one page in both engines (the recipe's Footnote Text keeps a note's lines together, typst sets the entry as one unbreakable block) instead of splitting where LibreOffice splits one; renders unchanged but for the docx package; docx XENG-001..003 still pass (229/229 lines), typst 9 and docx 13 passed, 0 failed (fb-595.68.27)
</commit_message>
<xml_diff>
--- a/courts/seventh-circuit/indiana/federal/bankruptcy-northern-district/adversary-complaint/usage/OUTPUT-adversary-complaint.docx
+++ b/courts/seventh-circuit/indiana/federal/bankruptcy-northern-district/adversary-complaint/usage/OUTPUT-adversary-complaint.docx
@@ -2246,11 +2246,14 @@
     </w:pPr>
   </w:style>
   <w:style w:type="paragraph" w:styleId="FootnoteText">
-    <w:name w:val="footnote text"/>
+    <w:name w:val="Footnote Text"/>
     <w:basedOn w:val="Normal"/>
-    <w:qFormat/>
-    <w:pPr>
-      <w:widowControl/>
+    <w:next w:val="FootnoteText"/>
+    <w:uiPriority w:val="9"/>
+    <w:unhideWhenUsed/>
+    <w:qFormat/>
+    <w:pPr>
+      <w:keepLines/>
       <w:spacing w:before="0" w:after="140" w:line="276" w:lineRule="exact"/>
     </w:pPr>
     <w:rPr>

</xml_diff>